<commit_message>
feat: add home news/top components, message page updates and images
</commit_message>
<xml_diff>
--- a/实验3 前台首页开发.docx
+++ b/实验3 前台首页开发.docx
@@ -1363,12 +1363,6 @@
                         <w:insideH w:val="single" w:color="auto" w:sz="4" w:space="0"/>
                         <w:insideV w:val="single" w:color="auto" w:sz="4" w:space="0"/>
                       </w:tblBorders>
-                      <w:tblCellMar>
-                        <w:top w:w="0" w:type="dxa"/>
-                        <w:left w:w="108" w:type="dxa"/>
-                        <w:bottom w:w="0" w:type="dxa"/>
-                        <w:right w:w="108" w:type="dxa"/>
-                      </w:tblCellMar>
                     </w:tblPrEx>
                     <w:tc>
                       <w:tcPr>
@@ -2026,12 +2020,6 @@
                         <w:insideH w:val="single" w:color="auto" w:sz="4" w:space="0"/>
                         <w:insideV w:val="single" w:color="auto" w:sz="4" w:space="0"/>
                       </w:tblBorders>
-                      <w:tblCellMar>
-                        <w:top w:w="0" w:type="dxa"/>
-                        <w:left w:w="108" w:type="dxa"/>
-                        <w:bottom w:w="0" w:type="dxa"/>
-                        <w:right w:w="108" w:type="dxa"/>
-                      </w:tblCellMar>
                     </w:tblPrEx>
                     <w:tc>
                       <w:tcPr>
@@ -3507,8 +3495,8 @@
                   <w:r>
                     <w:drawing>
                       <wp:inline distT="0" distB="0" distL="114300" distR="114300">
-                        <wp:extent cx="1477645" cy="3022600"/>
-                        <wp:effectExtent l="0" t="0" r="8255" b="6350"/>
+                        <wp:extent cx="1463675" cy="2994025"/>
+                        <wp:effectExtent l="0" t="0" r="3175" b="15875"/>
                         <wp:docPr id="2" name="图片 2"/>
                         <wp:cNvGraphicFramePr>
                           <a:graphicFrameLocks xmlns:a="http://schemas.openxmlformats.org/drawingml/2006/main" noChangeAspect="1"/>
@@ -3531,7 +3519,7 @@
                               <pic:spPr>
                                 <a:xfrm>
                                   <a:off x="0" y="0"/>
-                                  <a:ext cx="1477645" cy="3022600"/>
+                                  <a:ext cx="1463675" cy="2994025"/>
                                 </a:xfrm>
                                 <a:prstGeom prst="rect">
                                   <a:avLst/>
@@ -9056,8 +9044,6 @@
                     </w:rPr>
                     <w:t>''</w:t>
                   </w:r>
-                  <w:bookmarkStart w:id="0" w:name="_GoBack"/>
-                  <w:bookmarkEnd w:id="0"/>
                 </w:p>
                 <w:p>
                   <w:pPr>
@@ -9424,7 +9410,7 @@
                     <w:jc w:val="left"/>
                     <w:textAlignment w:val="auto"/>
                     <w:rPr>
-                      <w:rFonts w:hint="default" w:ascii="Times New Roman" w:hAnsi="Times New Roman" w:eastAsia="宋体" w:cs="Consolas"/>
+                      <w:rFonts w:hint="eastAsia" w:ascii="Times New Roman" w:hAnsi="Times New Roman" w:eastAsia="宋体" w:cs="Consolas"/>
                       <w:b w:val="0"/>
                       <w:bCs w:val="0"/>
                       <w:color w:val="000000" w:themeColor="text1"/>
@@ -9458,6 +9444,130 @@
                       </w14:textFill>
                     </w:rPr>
                     <w:t>4. 启动服务并查看效果，截图为：</w:t>
+                  </w:r>
+                </w:p>
+                <w:p>
+                  <w:pPr>
+                    <w:keepNext w:val="0"/>
+                    <w:keepLines w:val="0"/>
+                    <w:pageBreakBefore w:val="0"/>
+                    <w:widowControl/>
+                    <w:suppressLineNumbers w:val="0"/>
+                    <w:shd w:val="clear" w:fill="FFFFFF"/>
+                    <w:kinsoku/>
+                    <w:wordWrap/>
+                    <w:overflowPunct/>
+                    <w:topLinePunct w:val="0"/>
+                    <w:autoSpaceDE/>
+                    <w:autoSpaceDN/>
+                    <w:bidi w:val="0"/>
+                    <w:adjustRightInd/>
+                    <w:snapToGrid/>
+                    <w:spacing w:line="300" w:lineRule="auto"/>
+                    <w:jc w:val="left"/>
+                    <w:textAlignment w:val="auto"/>
+                    <w:rPr>
+                      <w:rFonts w:hint="default" w:ascii="Times New Roman" w:hAnsi="Times New Roman" w:eastAsia="宋体" w:cs="Consolas"/>
+                      <w:b w:val="0"/>
+                      <w:bCs w:val="0"/>
+                      <w:color w:val="000000" w:themeColor="text1"/>
+                      <w:kern w:val="0"/>
+                      <w:sz w:val="24"/>
+                      <w:szCs w:val="24"/>
+                      <w:shd w:val="clear" w:fill="FFFFFF"/>
+                      <w:lang w:val="en-US" w:eastAsia="zh-CN" w:bidi="ar"/>
+                      <w14:textFill>
+                        <w14:solidFill>
+                          <w14:schemeClr w14:val="tx1"/>
+                        </w14:solidFill>
+                      </w14:textFill>
+                    </w:rPr>
+                  </w:pPr>
+                  <w:r>
+                    <w:drawing>
+                      <wp:inline distT="0" distB="0" distL="114300" distR="114300">
+                        <wp:extent cx="1643380" cy="3328035"/>
+                        <wp:effectExtent l="0" t="0" r="13970" b="5715"/>
+                        <wp:docPr id="3" name="图片 1"/>
+                        <wp:cNvGraphicFramePr>
+                          <a:graphicFrameLocks xmlns:a="http://schemas.openxmlformats.org/drawingml/2006/main" noChangeAspect="1"/>
+                        </wp:cNvGraphicFramePr>
+                        <a:graphic xmlns:a="http://schemas.openxmlformats.org/drawingml/2006/main">
+                          <a:graphicData uri="http://schemas.openxmlformats.org/drawingml/2006/picture">
+                            <pic:pic xmlns:pic="http://schemas.openxmlformats.org/drawingml/2006/picture">
+                              <pic:nvPicPr>
+                                <pic:cNvPr id="3" name="图片 1"/>
+                                <pic:cNvPicPr>
+                                  <a:picLocks noChangeAspect="1"/>
+                                </pic:cNvPicPr>
+                              </pic:nvPicPr>
+                              <pic:blipFill>
+                                <a:blip r:embed="rId7"/>
+                                <a:stretch>
+                                  <a:fillRect/>
+                                </a:stretch>
+                              </pic:blipFill>
+                              <pic:spPr>
+                                <a:xfrm>
+                                  <a:off x="0" y="0"/>
+                                  <a:ext cx="1643380" cy="3328035"/>
+                                </a:xfrm>
+                                <a:prstGeom prst="rect">
+                                  <a:avLst/>
+                                </a:prstGeom>
+                                <a:noFill/>
+                                <a:ln>
+                                  <a:noFill/>
+                                </a:ln>
+                              </pic:spPr>
+                            </pic:pic>
+                          </a:graphicData>
+                        </a:graphic>
+                      </wp:inline>
+                    </w:drawing>
+                  </w:r>
+                  <w:r>
+                    <w:drawing>
+                      <wp:inline distT="0" distB="0" distL="114300" distR="114300">
+                        <wp:extent cx="1560830" cy="3318510"/>
+                        <wp:effectExtent l="0" t="0" r="1270" b="15240"/>
+                        <wp:docPr id="4" name="图片 2"/>
+                        <wp:cNvGraphicFramePr>
+                          <a:graphicFrameLocks xmlns:a="http://schemas.openxmlformats.org/drawingml/2006/main" noChangeAspect="1"/>
+                        </wp:cNvGraphicFramePr>
+                        <a:graphic xmlns:a="http://schemas.openxmlformats.org/drawingml/2006/main">
+                          <a:graphicData uri="http://schemas.openxmlformats.org/drawingml/2006/picture">
+                            <pic:pic xmlns:pic="http://schemas.openxmlformats.org/drawingml/2006/picture">
+                              <pic:nvPicPr>
+                                <pic:cNvPr id="4" name="图片 2"/>
+                                <pic:cNvPicPr>
+                                  <a:picLocks noChangeAspect="1"/>
+                                </pic:cNvPicPr>
+                              </pic:nvPicPr>
+                              <pic:blipFill>
+                                <a:blip r:embed="rId8"/>
+                                <a:stretch>
+                                  <a:fillRect/>
+                                </a:stretch>
+                              </pic:blipFill>
+                              <pic:spPr>
+                                <a:xfrm>
+                                  <a:off x="0" y="0"/>
+                                  <a:ext cx="1560830" cy="3318510"/>
+                                </a:xfrm>
+                                <a:prstGeom prst="rect">
+                                  <a:avLst/>
+                                </a:prstGeom>
+                                <a:noFill/>
+                                <a:ln>
+                                  <a:noFill/>
+                                </a:ln>
+                              </pic:spPr>
+                            </pic:pic>
+                          </a:graphicData>
+                        </a:graphic>
+                      </wp:inline>
+                    </w:drawing>
                   </w:r>
                 </w:p>
                 <w:p>
@@ -9760,7 +9870,7 @@
                         </w14:solidFill>
                       </w14:textFill>
                     </w:rPr>
-                    <w:t xml:space="preserve">          </w:t>
+                    <w:t xml:space="preserve">  v-for="item in goodsList"  </w:t>
                   </w:r>
                   <w:r>
                     <w:rPr>
@@ -9855,7 +9965,7 @@
                         </w14:solidFill>
                       </w14:textFill>
                     </w:rPr>
-                    <w:t xml:space="preserve">          </w:t>
+                    <w:t xml:space="preserve"> :thumb  </w:t>
                   </w:r>
                   <w:r>
                     <w:rPr>
@@ -9922,7 +10032,7 @@
                         </w14:solidFill>
                       </w14:textFill>
                     </w:rPr>
-                    <w:t xml:space="preserve">          </w:t>
+                    <w:t xml:space="preserve"> :price  </w:t>
                   </w:r>
                   <w:r>
                     <w:rPr>
@@ -9989,7 +10099,7 @@
                         </w14:solidFill>
                       </w14:textFill>
                     </w:rPr>
-                    <w:t xml:space="preserve">          </w:t>
+                    <w:t xml:space="preserve"> :origin-price  </w:t>
                   </w:r>
                   <w:r>
                     <w:rPr>
@@ -10056,7 +10166,7 @@
                         </w14:solidFill>
                       </w14:textFill>
                     </w:rPr>
-                    <w:t xml:space="preserve">          </w:t>
+                    <w:t xml:space="preserve"> :title </w:t>
                   </w:r>
                   <w:r>
                     <w:rPr>
@@ -10123,7 +10233,7 @@
                         </w14:solidFill>
                       </w14:textFill>
                     </w:rPr>
-                    <w:t xml:space="preserve">          </w:t>
+                    <w:t xml:space="preserve"> :desc   </w:t>
                   </w:r>
                   <w:r>
                     <w:rPr>
@@ -10190,7 +10300,7 @@
                         </w14:solidFill>
                       </w14:textFill>
                     </w:rPr>
-                    <w:t xml:space="preserve">          </w:t>
+                    <w:t xml:space="preserve"> :tag   </w:t>
                   </w:r>
                   <w:r>
                     <w:rPr>
@@ -10368,6 +10478,94 @@
                       <w:lang w:val="en-US" w:eastAsia="zh-CN"/>
                     </w:rPr>
                   </w:pPr>
+                  <w:r>
+                    <w:drawing>
+                      <wp:inline distT="0" distB="0" distL="114300" distR="114300">
+                        <wp:extent cx="1397635" cy="2967990"/>
+                        <wp:effectExtent l="0" t="0" r="12065" b="3810"/>
+                        <wp:docPr id="5" name="图片 1"/>
+                        <wp:cNvGraphicFramePr>
+                          <a:graphicFrameLocks xmlns:a="http://schemas.openxmlformats.org/drawingml/2006/main" noChangeAspect="1"/>
+                        </wp:cNvGraphicFramePr>
+                        <a:graphic xmlns:a="http://schemas.openxmlformats.org/drawingml/2006/main">
+                          <a:graphicData uri="http://schemas.openxmlformats.org/drawingml/2006/picture">
+                            <pic:pic xmlns:pic="http://schemas.openxmlformats.org/drawingml/2006/picture">
+                              <pic:nvPicPr>
+                                <pic:cNvPr id="5" name="图片 1"/>
+                                <pic:cNvPicPr>
+                                  <a:picLocks noChangeAspect="1"/>
+                                </pic:cNvPicPr>
+                              </pic:nvPicPr>
+                              <pic:blipFill>
+                                <a:blip r:embed="rId9"/>
+                                <a:stretch>
+                                  <a:fillRect/>
+                                </a:stretch>
+                              </pic:blipFill>
+                              <pic:spPr>
+                                <a:xfrm>
+                                  <a:off x="0" y="0"/>
+                                  <a:ext cx="1397635" cy="2967990"/>
+                                </a:xfrm>
+                                <a:prstGeom prst="rect">
+                                  <a:avLst/>
+                                </a:prstGeom>
+                                <a:noFill/>
+                                <a:ln>
+                                  <a:noFill/>
+                                </a:ln>
+                              </pic:spPr>
+                            </pic:pic>
+                          </a:graphicData>
+                        </a:graphic>
+                      </wp:inline>
+                    </w:drawing>
+                  </w:r>
+                  <w:r>
+                    <w:drawing>
+                      <wp:inline distT="0" distB="0" distL="114300" distR="114300">
+                        <wp:extent cx="1387475" cy="2981325"/>
+                        <wp:effectExtent l="0" t="0" r="3175" b="9525"/>
+                        <wp:docPr id="6" name="图片 4"/>
+                        <wp:cNvGraphicFramePr>
+                          <a:graphicFrameLocks xmlns:a="http://schemas.openxmlformats.org/drawingml/2006/main" noChangeAspect="1"/>
+                        </wp:cNvGraphicFramePr>
+                        <a:graphic xmlns:a="http://schemas.openxmlformats.org/drawingml/2006/main">
+                          <a:graphicData uri="http://schemas.openxmlformats.org/drawingml/2006/picture">
+                            <pic:pic xmlns:pic="http://schemas.openxmlformats.org/drawingml/2006/picture">
+                              <pic:nvPicPr>
+                                <pic:cNvPr id="6" name="图片 4"/>
+                                <pic:cNvPicPr>
+                                  <a:picLocks noChangeAspect="1"/>
+                                </pic:cNvPicPr>
+                              </pic:nvPicPr>
+                              <pic:blipFill>
+                                <a:blip r:embed="rId10"/>
+                                <a:stretch>
+                                  <a:fillRect/>
+                                </a:stretch>
+                              </pic:blipFill>
+                              <pic:spPr>
+                                <a:xfrm>
+                                  <a:off x="0" y="0"/>
+                                  <a:ext cx="1387475" cy="2981325"/>
+                                </a:xfrm>
+                                <a:prstGeom prst="rect">
+                                  <a:avLst/>
+                                </a:prstGeom>
+                                <a:noFill/>
+                                <a:ln>
+                                  <a:noFill/>
+                                </a:ln>
+                              </pic:spPr>
+                            </pic:pic>
+                          </a:graphicData>
+                        </a:graphic>
+                      </wp:inline>
+                    </w:drawing>
+                  </w:r>
+                  <w:bookmarkStart w:id="0" w:name="_GoBack"/>
+                  <w:bookmarkEnd w:id="0"/>
                 </w:p>
                 <w:p>
                   <w:pPr>
@@ -10599,10 +10797,10 @@
     <w:lsdException w:uiPriority="99" w:name="HTML Acronym"/>
     <w:lsdException w:uiPriority="99" w:name="HTML Address"/>
     <w:lsdException w:uiPriority="99" w:name="HTML Cite"/>
-    <w:lsdException w:uiPriority="99" w:name="HTML Code"/>
+    <w:lsdException w:qFormat="1" w:uiPriority="99" w:name="HTML Code"/>
     <w:lsdException w:uiPriority="99" w:name="HTML Definition"/>
     <w:lsdException w:uiPriority="99" w:name="HTML Keyboard"/>
-    <w:lsdException w:uiPriority="99" w:name="HTML Preformatted"/>
+    <w:lsdException w:qFormat="1" w:uiPriority="99" w:name="HTML Preformatted"/>
     <w:lsdException w:uiPriority="99" w:name="HTML Sample"/>
     <w:lsdException w:uiPriority="99" w:name="HTML Typewriter"/>
     <w:lsdException w:uiPriority="99" w:name="HTML Variable"/>
@@ -10864,6 +11062,7 @@
     <w:basedOn w:val="1"/>
     <w:semiHidden/>
     <w:unhideWhenUsed/>
+    <w:qFormat/>
     <w:uiPriority w:val="99"/>
     <w:pPr>
       <w:tabs>
@@ -10929,6 +11128,7 @@
     <w:basedOn w:val="10"/>
     <w:semiHidden/>
     <w:unhideWhenUsed/>
+    <w:qFormat/>
     <w:uiPriority w:val="99"/>
     <w:rPr>
       <w:rFonts w:ascii="Courier New" w:hAnsi="Courier New"/>

</xml_diff>